<commit_message>
fix: validate legacy office rendering models
</commit_message>
<xml_diff>
--- a/public/fixtures/regressions/office-preview-showcase.docx
+++ b/public/fixtures/regressions/office-preview-showcase.docx
@@ -1376,7 +1376,7 @@
         <w:pStyle w:val="Marker"/>
       </w:pPr>
       <w:r>
-        <w:t>W20 legacy DOC OLE chart is covered by the focused Example Document Title.doc regression.</w:t>
+        <w:t>W20 legacy DOC OLE chart is covered by the focused Example Title.doc regression.</w:t>
       </w:r>
     </w:p>
     <w:p>
@@ -1400,7 +1400,7 @@
 
 <file path=word/comments.xml><?xml version="1.0" encoding="utf-8"?>
 <w:comments xmlns:a="http://schemas.openxmlformats.org/drawingml/2006/main" xmlns:pic="http://schemas.openxmlformats.org/drawingml/2006/picture" xmlns:r="http://schemas.openxmlformats.org/officeDocument/2006/relationships" xmlns:w="http://schemas.openxmlformats.org/wordprocessingml/2006/main" xmlns:wp="http://schemas.openxmlformats.org/drawingml/2006/wordprocessingDrawing" xmlns:mc="http://schemas.openxmlformats.org/markup-compatibility/2006" xmlns:a14="http://schemas.microsoft.com/office/drawing/2010/main" xmlns:w14="http://schemas.microsoft.com/office/word/2010/wordml" xmlns:wpc="http://schemas.microsoft.com/office/word/2010/wordprocessingCanvas">
-  <w:comment w:id="0" w:author="Nexolyra QA" w:initials="NQ" w:date="2026-07-22T06:56:21Z">
+  <w:comment w:id="0" w:author="Nexolyra QA" w:initials="NQ" w:date="2026-07-22T09:15:36Z">
     <w:p>
       <w:pPr>
         <w:pStyle w:val="CommentText"/>

</xml_diff>